<commit_message>
docs(resume): 两份 docx 同步到 283 测试 / 14 张表 / 三层记忆
docx 落后两轮（停在 220 测试、11 张表的版本），缺的不只是数字，还有整块三层
记忆的内容。按段落级别 patch word/document.xml，保留原有排版：
pPr 与首个 run 的 rPr 原样克隆，只换文字。

PlanPilot_面试定稿.docx：
- 1.2 规模、8.3 标题、E 追问链：220 → 283；ORM 表 11 → 14；APIRouter 9 → 10
- 2.6 工具调用跨轮：工具轨迹现在落 chat_tool_calls，但仍不喂回模型
- 4.2 压缩：补"先折叠再闸门"，删掉"摘要层当前没做"的旧说法
- 4.4 整节重写：从"Memory 加锁能保证什么"改成"后来为什么把共享状态拿掉"
- 新增 4.5 记忆分几层（原 4.5 向量记忆顺延为 4.6）
- 6.6 快照：十一张 → 十四张，另补 chat_tool_calls / session_summaries /
  memory_facts 到表清单
- 9.5 多 worker：从"Memory 进程内"改成"只有模型故障状态还是进程内的"
- 速记表 Memory 容量那一行 → 会话历史窗口（读 60 条 / 保留 10 条）
- 八条"不等于"里 Memory 方法锁 → 轨迹落库不等于能重放上下文

AI_Agent_必学知识库目录.docx：三处"关联"段落 + 一处提问标题同步。

校验：XML 合法、段落 529 → 533（只多新增那 4 段）、表格 6、超链接 13、
域代码 40、书签 13 全部与 patch 前一致，paraId 无重复。目录是 TOC 域，
新增章节后需要在 Word 里按 F9 更新页码。
</commit_message>
<xml_diff>
--- a/docs/resume/AI_Agent_必学知识库目录.docx
+++ b/docs/resume/AI_Agent_必学知识库目录.docx
@@ -11581,7 +11581,7 @@
           <w:color w:val="1A1A1A"/>
           <w:szCs w:val="21"/>
         </w:rPr>
-        <w:t>关联：Memory 和模型故障状态都是进程内的。</w:t>
+        <w:t xml:space="preserve">关联：会话历史与工具轨迹都已落库，只有模型故障状态还是进程内的。</w:t>
       </w:r>
     </w:p>
     <w:p>
@@ -12173,25 +12173,7 @@
           <w:color w:val="1A1A1A"/>
           <w:szCs w:val="21"/>
         </w:rPr>
-        <w:t>关联：</w:t>
-      </w:r>
-      <w:proofErr w:type="spellStart"/>
-      <w:r>
-        <w:rPr>
-          <w:rFonts w:ascii="宋体" w:eastAsia="宋体" w:hAnsi="宋体" w:cs="宋体" w:hint="eastAsia"/>
-          <w:color w:val="1A1A1A"/>
-          <w:szCs w:val="21"/>
-        </w:rPr>
-        <w:t>PlanPilot</w:t>
-      </w:r>
-      <w:proofErr w:type="spellEnd"/>
-      <w:r>
-        <w:rPr>
-          <w:rFonts w:ascii="宋体" w:eastAsia="宋体" w:hAnsi="宋体" w:cs="宋体" w:hint="eastAsia"/>
-          <w:color w:val="1A1A1A"/>
-          <w:szCs w:val="21"/>
-        </w:rPr>
-        <w:t xml:space="preserve"> 的 220 个测试分布在这几层。</w:t>
+        <w:t xml:space="preserve">PlanPilot 的 283 个测试分布在这几层。</w:t>
       </w:r>
     </w:p>
     <w:p>
@@ -12859,7 +12841,7 @@
           <w:color w:val="1A1A1A"/>
           <w:szCs w:val="21"/>
         </w:rPr>
-        <w:t>关联：Memory 的线程锁。</w:t>
+        <w:t xml:space="preserve">关联：PlanPilot 最终没给会话状态加锁，而是把状态从进程里拿掉——从 chat_messages 读窗口，多 worker 天然一致。</w:t>
       </w:r>
     </w:p>
     <w:p>
@@ -14902,7 +14884,7 @@
           <w:color w:val="1A1A1A"/>
           <w:szCs w:val="21"/>
         </w:rPr>
-        <w:t>Memory 加锁能保证同一会话不交错吗？</w:t>
+        <w:t xml:space="preserve">会话历史不放进程内存，还剩哪些一致性问题？</w:t>
       </w:r>
     </w:p>
     <w:p>

</xml_diff>